<commit_message>
Refactor table border rendering and junction handling
- Updated the documentation for double borders to clarify their rendering behavior, emphasizing that they consist of two lines side by side rather than stacked.
- Adjusted test cases to reflect the correct dimensions and positions of borders in relation to junctions.
- Introduced a new test suite for verifying the color behavior of border junctions, particularly focusing on how Word handles crossings between vertical and horizontal borders.
- Enhanced the logic for determining the dimensions of borders, ensuring that double borders are treated as three rules wide, with appropriate spacing.
- Improved the handling of vertical and horizontal segments in the layout calculations, ensuring accurate recovery of grid lines from rendered rectangles.
</commit_message>
<xml_diff>
--- a/test-files/border-junction-colour.docx
+++ b/test-files/border-junction-colour.docx
@@ -28,6 +28,11 @@
     <w:p>
       <w:r>
         <w:t xml:space="preserve">  - pale in table 1, dark in table 2      -&gt; the horizontal always wins</w:t>
+      </w:r>
+    </w:p>
+    <w:p>
+      <w:r>
+        <w:t xml:space="preserve">MEASURED: Word draws pale in table 1 and dark in table 2. The horizontal takes the square, whichever axis carries the darker line.</w:t>
       </w:r>
     </w:p>
     <w:p>
@@ -283,12 +288,12 @@
         <w:rPr>
           <w:b/>
         </w:rPr>
-        <w:t xml:space="preserve">Table 3 - both axes 12pt double. Not a discrimination: a known limit.</w:t>
-      </w:r>
-    </w:p>
-    <w:p>
-      <w:r>
-        <w:t xml:space="preserve">A double is two rules with a gap, so the crossing should ideally be a two-by-two lattice of ink with both gaps running through it. This engine draws the square along one axis instead, which gives two rungs. What Word draws here is worth recording.</w:t>
+        <w:t xml:space="preserve">Table 3 - both axes 12pt double. MEASURED.</w:t>
+      </w:r>
+    </w:p>
+    <w:p>
+      <w:r>
+        <w:t xml:space="preserve">A double is two rules with a gap, so the crossing is ideally a two-by-two lattice of ink with both gaps running through it, and that is what Word draws: the borders read as negative space, so every cell looks separately enclosed. The engine drew the square along one axis instead, which gave two rungs.</w:t>
       </w:r>
     </w:p>
     <w:tbl>
@@ -397,6 +402,264 @@
           <w:p>
             <w:r>
               <w:t xml:space="preserve">i</w:t>
+            </w:r>
+          </w:p>
+        </w:tc>
+      </w:tr>
+    </w:tbl>
+    <w:p>
+      <w:r>
+        <w:t xml:space="preserve"/>
+      </w:r>
+    </w:p>
+    <w:p>
+      <w:r>
+        <w:rPr>
+          <w:b/>
+        </w:rPr>
+        <w:t xml:space="preserve">Table 4 - 12pt single horizontal crossing a 12pt double vertical. OPEN.</w:t>
+      </w:r>
+    </w:p>
+    <w:p>
+      <w:r>
+        <w:t xml:space="preserve">Tables 1 to 3 settle a crossing into the product of its two axes: each one divides the square across its own short side, and the horizontal colours it. This is the shape that product makes a claim about with no measurement behind it. Read whether the solid horizontal runs through the crossing unbroken, or whether the vertical's 4pt gap is punched through it, leaving the horizontal in two pieces at every crossing.</w:t>
+      </w:r>
+    </w:p>
+    <w:tbl>
+      <w:tblPr>
+        <w:tblW w:w="6000" w:type="dxa"/>
+        <w:tblBorders>
+          <w:insideV w:val="double" w:sz="96" w:space="0" w:color="000000"/>
+          <w:insideH w:val="single" w:sz="96" w:space="0" w:color="000000"/>
+        </w:tblBorders>
+        <w:tblLayout w:type="fixed"/>
+      </w:tblPr>
+      <w:tblGrid>
+        <w:gridCol w:w="2000"/>
+        <w:gridCol w:w="2000"/>
+        <w:gridCol w:w="2000"/>
+      </w:tblGrid>
+      <w:tr>
+        <w:tc>
+          <w:tcPr>
+            <w:tcW w:w="2000" w:type="dxa"/>
+          </w:tcPr>
+          <w:p>
+            <w:r>
+              <w:t xml:space="preserve">e</w:t>
+            </w:r>
+          </w:p>
+        </w:tc>
+        <w:tc>
+          <w:tcPr>
+            <w:tcW w:w="2000" w:type="dxa"/>
+          </w:tcPr>
+          <w:p>
+            <w:r>
+              <w:t xml:space="preserve">f</w:t>
+            </w:r>
+          </w:p>
+        </w:tc>
+        <w:tc>
+          <w:tcPr>
+            <w:tcW w:w="2000" w:type="dxa"/>
+          </w:tcPr>
+          <w:p>
+            <w:r>
+              <w:t xml:space="preserve">g</w:t>
+            </w:r>
+          </w:p>
+        </w:tc>
+      </w:tr>
+      <w:tr>
+        <w:tc>
+          <w:tcPr>
+            <w:tcW w:w="2000" w:type="dxa"/>
+          </w:tcPr>
+          <w:p>
+            <w:r>
+              <w:t xml:space="preserve">e</w:t>
+            </w:r>
+          </w:p>
+        </w:tc>
+        <w:tc>
+          <w:tcPr>
+            <w:tcW w:w="2000" w:type="dxa"/>
+          </w:tcPr>
+          <w:p>
+            <w:r>
+              <w:t xml:space="preserve">f</w:t>
+            </w:r>
+          </w:p>
+        </w:tc>
+        <w:tc>
+          <w:tcPr>
+            <w:tcW w:w="2000" w:type="dxa"/>
+          </w:tcPr>
+          <w:p>
+            <w:r>
+              <w:t xml:space="preserve">g</w:t>
+            </w:r>
+          </w:p>
+        </w:tc>
+      </w:tr>
+      <w:tr>
+        <w:tc>
+          <w:tcPr>
+            <w:tcW w:w="2000" w:type="dxa"/>
+          </w:tcPr>
+          <w:p>
+            <w:r>
+              <w:t xml:space="preserve">e</w:t>
+            </w:r>
+          </w:p>
+        </w:tc>
+        <w:tc>
+          <w:tcPr>
+            <w:tcW w:w="2000" w:type="dxa"/>
+          </w:tcPr>
+          <w:p>
+            <w:r>
+              <w:t xml:space="preserve">f</w:t>
+            </w:r>
+          </w:p>
+        </w:tc>
+        <w:tc>
+          <w:tcPr>
+            <w:tcW w:w="2000" w:type="dxa"/>
+          </w:tcPr>
+          <w:p>
+            <w:r>
+              <w:t xml:space="preserve">g</w:t>
+            </w:r>
+          </w:p>
+        </w:tc>
+      </w:tr>
+    </w:tbl>
+    <w:p>
+      <w:r>
+        <w:t xml:space="preserve"/>
+      </w:r>
+    </w:p>
+    <w:p>
+      <w:r>
+        <w:rPr>
+          <w:b/>
+        </w:rPr>
+        <w:t xml:space="preserve">Table 5 - a 12pt black vertical crossing a 3pt pale horizontal. OPEN.</w:t>
+      </w:r>
+    </w:p>
+    <w:p>
+      <w:r>
+        <w:t xml:space="preserve">Tables 1 and 2 tie the two axes on weight, which is what makes them a test of colour and also what keeps them silent about weight. Read the crossings: a pale 3pt band interrupting the thick black vertical means the horizontal wins whatever its weight, and a black crossing that interrupts the pale line instead means the heavier line wins.</w:t>
+      </w:r>
+    </w:p>
+    <w:tbl>
+      <w:tblPr>
+        <w:tblW w:w="6000" w:type="dxa"/>
+        <w:tblBorders>
+          <w:insideV w:val="single" w:sz="96" w:space="0" w:color="000000"/>
+          <w:insideH w:val="single" w:sz="24" w:space="0" w:color="BFBFBF"/>
+        </w:tblBorders>
+        <w:tblLayout w:type="fixed"/>
+      </w:tblPr>
+      <w:tblGrid>
+        <w:gridCol w:w="2000"/>
+        <w:gridCol w:w="2000"/>
+        <w:gridCol w:w="2000"/>
+      </w:tblGrid>
+      <w:tr>
+        <w:tc>
+          <w:tcPr>
+            <w:tcW w:w="2000" w:type="dxa"/>
+          </w:tcPr>
+          <w:p>
+            <w:r>
+              <w:t xml:space="preserve">h</w:t>
+            </w:r>
+          </w:p>
+        </w:tc>
+        <w:tc>
+          <w:tcPr>
+            <w:tcW w:w="2000" w:type="dxa"/>
+          </w:tcPr>
+          <w:p>
+            <w:r>
+              <w:t xml:space="preserve">i</w:t>
+            </w:r>
+          </w:p>
+        </w:tc>
+        <w:tc>
+          <w:tcPr>
+            <w:tcW w:w="2000" w:type="dxa"/>
+          </w:tcPr>
+          <w:p>
+            <w:r>
+              <w:t xml:space="preserve">j</w:t>
+            </w:r>
+          </w:p>
+        </w:tc>
+      </w:tr>
+      <w:tr>
+        <w:tc>
+          <w:tcPr>
+            <w:tcW w:w="2000" w:type="dxa"/>
+          </w:tcPr>
+          <w:p>
+            <w:r>
+              <w:t xml:space="preserve">h</w:t>
+            </w:r>
+          </w:p>
+        </w:tc>
+        <w:tc>
+          <w:tcPr>
+            <w:tcW w:w="2000" w:type="dxa"/>
+          </w:tcPr>
+          <w:p>
+            <w:r>
+              <w:t xml:space="preserve">i</w:t>
+            </w:r>
+          </w:p>
+        </w:tc>
+        <w:tc>
+          <w:tcPr>
+            <w:tcW w:w="2000" w:type="dxa"/>
+          </w:tcPr>
+          <w:p>
+            <w:r>
+              <w:t xml:space="preserve">j</w:t>
+            </w:r>
+          </w:p>
+        </w:tc>
+      </w:tr>
+      <w:tr>
+        <w:tc>
+          <w:tcPr>
+            <w:tcW w:w="2000" w:type="dxa"/>
+          </w:tcPr>
+          <w:p>
+            <w:r>
+              <w:t xml:space="preserve">h</w:t>
+            </w:r>
+          </w:p>
+        </w:tc>
+        <w:tc>
+          <w:tcPr>
+            <w:tcW w:w="2000" w:type="dxa"/>
+          </w:tcPr>
+          <w:p>
+            <w:r>
+              <w:t xml:space="preserve">i</w:t>
+            </w:r>
+          </w:p>
+        </w:tc>
+        <w:tc>
+          <w:tcPr>
+            <w:tcW w:w="2000" w:type="dxa"/>
+          </w:tcPr>
+          <w:p>
+            <w:r>
+              <w:t xml:space="preserve">j</w:t>
             </w:r>
           </w:p>
         </w:tc>

</xml_diff>

<commit_message>
Refine border geometry rules and update tests
- Clarified the rules for how horizontal and vertical lines interact at junctions, emphasizing that at equal weight, the horizontal line takes precedence.
- Updated documentation to reflect the changes in rendering behavior observed in Word, specifically regarding color precedence and weight considerations.
- Enhanced the test suite to include new cases that measure the behavior of borders with differing weights, ensuring that the heavier line takes precedence in crossings.
- Adjusted the logic in `rasterize_border_grid` to correctly handle junction color assignment based on the weight of the lines.
- Updated the `border-junction-colour.docx` file to include new test cases that validate the updated rules.
</commit_message>
<xml_diff>
--- a/test-files/border-junction-colour.docx
+++ b/test-files/border-junction-colour.docx
@@ -32,7 +32,7 @@
     </w:p>
     <w:p>
       <w:r>
-        <w:t xml:space="preserve">MEASURED: Word draws pale in table 1 and dark in table 2. The horizontal takes the square, whichever axis carries the darker line.</w:t>
+        <w:t xml:space="preserve">MEASURED: Word draws pale in table 1 and dark in table 2. At equal weight the horizontal takes the square, whichever axis is darker - so colour never decides. Table 5 adds the weight half.</w:t>
       </w:r>
     </w:p>
     <w:p>
@@ -546,12 +546,12 @@
         <w:rPr>
           <w:b/>
         </w:rPr>
-        <w:t xml:space="preserve">Table 5 - a 12pt black vertical crossing a 3pt pale horizontal. OPEN.</w:t>
-      </w:r>
-    </w:p>
-    <w:p>
-      <w:r>
-        <w:t xml:space="preserve">Tables 1 and 2 tie the two axes on weight, which is what makes them a test of colour and also what keeps them silent about weight. Read the crossings: a pale 3pt band interrupting the thick black vertical means the horizontal wins whatever its weight, and a black crossing that interrupts the pale line instead means the heavier line wins.</w:t>
+        <w:t xml:space="preserve">Table 5 - a 12pt black vertical crossing a 3pt pale horizontal. MEASURED.</w:t>
+      </w:r>
+    </w:p>
+    <w:p>
+      <w:r>
+        <w:t xml:space="preserve">Tables 1 and 2 tie the two axes on weight, which is what makes them a test of colour and also what keeps them silent about weight. Word draws the vertical through these crossings, so the heavier line wins and the horizontal only breaks a tie - which is the 17.4.66 weight step and nothing after it.</w:t>
       </w:r>
     </w:p>
     <w:tbl>

</xml_diff>